<commit_message>
Real training run against the actual UCI dataset
Replaces the placeholder synthetic-trained model with a genuine one.
Investigated and documented an important finding: test ROC-AUC (~0.52) is
well below BUILD_PROMPT.md's predicted ~0.78-0.81 band. Five independent
checks (leakage tests green, a from-scratch minimal baseline pipeline
hitting the same ceiling, the from-scratch drift monitor independently
flagging RETRAIN RECOMMENDED on the same train/test boundary, testing
HistGradientBoosting with and without early stopping) confirm this is a
real, explainable property of a strict chronological split on this
dataset -- 2008 alone is ~67% of all rows by volume, so TRAIN is almost
entirely pre-crisis while TEST spans deep into the 2009-2010 regime
change -- not an implementation bug. Documented in docs/RUNBOOK.md and
README.md rather than hidden.

Also regenerated benchmarks and the report against the real artifacts.
</commit_message>
<xml_diff>
--- a/reports/Final_Group_Project_Report.docx
+++ b/reports/Final_Group_Project_Report.docx
@@ -206,7 +206,7 @@
           </w:tcPr>
           <w:p>
             <w:r>
-              <w:t>4803</w:t>
+              <w:t>41188</w:t>
             </w:r>
           </w:p>
         </w:tc>
@@ -228,7 +228,7 @@
           </w:tcPr>
           <w:p>
             <w:r>
-              <w:t>3</w:t>
+              <w:t>12</w:t>
             </w:r>
           </w:p>
         </w:tc>
@@ -250,7 +250,7 @@
           </w:tcPr>
           <w:p>
             <w:r>
-              <w:t>82.14%</w:t>
+              <w:t>96.32%</w:t>
             </w:r>
           </w:p>
         </w:tc>
@@ -272,7 +272,7 @@
           </w:tcPr>
           <w:p>
             <w:r>
-              <w:t>3200 / 800 / 803</w:t>
+              <w:t>27972 / 8252 / 4964</w:t>
             </w:r>
           </w:p>
         </w:tc>
@@ -562,7 +562,7 @@
           </w:tcPr>
           <w:p>
             <w:r>
-              <w:t>AP 0.1725, ROC-AUC 0.6702</w:t>
+              <w:t>AP 0.1778, ROC-AUC 0.6050</w:t>
             </w:r>
           </w:p>
         </w:tc>
@@ -584,7 +584,7 @@
           </w:tcPr>
           <w:p>
             <w:r>
-              <w:t>AP 0.1156, ROC-AUC 0.6007</w:t>
+              <w:t>AP 0.1159, ROC-AUC 0.4995</w:t>
             </w:r>
           </w:p>
         </w:tc>
@@ -628,7 +628,7 @@
           </w:tcPr>
           <w:p>
             <w:r>
-              <w:t>AP 0.0838, ROC-AUC 0.5891, precision 0.0806, recall 0.6981</w:t>
+              <w:t>AP 0.4750, ROC-AUC 0.5240, precision 0.4450, recall 1.0000</w:t>
             </w:r>
           </w:p>
         </w:tc>
@@ -650,7 +650,7 @@
           </w:tcPr>
           <w:p>
             <w:r>
-              <w:t>0.4545 vs majority baseline 0.9340</w:t>
+              <w:t>0.4450 vs majority baseline 0.5550</w:t>
             </w:r>
           </w:p>
         </w:tc>
@@ -740,7 +740,7 @@
           </w:tcPr>
           <w:p>
             <w:r>
-              <w:t>0.0350</w:t>
+              <w:t>0.0050</w:t>
             </w:r>
           </w:p>
         </w:tc>
@@ -762,7 +762,7 @@
           </w:tcPr>
           <w:p>
             <w:r>
-              <w:t>2248.00</w:t>
+              <w:t>49920.00</w:t>
             </w:r>
           </w:p>
         </w:tc>
@@ -784,7 +784,7 @@
           </w:tcPr>
           <w:p>
             <w:r>
-              <w:t>1520.00</w:t>
+              <w:t>16.00</w:t>
             </w:r>
           </w:p>
         </w:tc>
@@ -893,7 +893,7 @@
           </w:tcPr>
           <w:p>
             <w:r>
-              <w:t>10023</w:t>
+              <w:t>11238</w:t>
             </w:r>
           </w:p>
         </w:tc>

</xml_diff>

<commit_message>
Deployment is live: add real Space screenshots to the report
Confirmed working end to end: took a real screenshot of the deployed
Space at https://huggingface.co/spaces/krish21may/bank, then drove an
actual scoring round trip against it (not a local instance) to prove
the live app produces a real prediction, not just that it loads.
Section 11 of the report now shows both, and Section 13's pending note
is removed since the link is live.
</commit_message>
<xml_diff>
--- a/reports/Final_Group_Project_Report.docx
+++ b/reports/Final_Group_Project_Report.docx
@@ -75,7 +75,7 @@
         <w:br/>
       </w:r>
       <w:r>
-        <w:t>Hugging Face Space: https://huggingface.co/spaces/krish2105/bank-conversion-copilot</w:t>
+        <w:t>Hugging Face Space: https://huggingface.co/spaces/krish21may/bank</w:t>
       </w:r>
     </w:p>
     <w:p>
@@ -1494,7 +1494,109 @@
     </w:p>
     <w:p>
       <w:r>
-        <w:t>[[ PENDING: the Hugging Face Space has not been created yet. This requires an account login and cannot be done by an automated agent -- see docs/RUNBOOK.md / README.md for the exact steps (check account age, create the Space, generate a token, add it as the HF_TOKEN GitHub secret, push to trigger deploy.yml). Once live, capture the app screen and drop it in as reports/screenshots/07-space-live.png, then re-run `make report`. ]]</w:t>
+        <w:t>The app is live on Hugging Face Spaces (ZeroGPU hardware, free tier), deployed automatically by deploy.yml. Screenshots below are from the live Space itself -- note the Hugging Face branding chip in the corner confirming this is not a local screenshot.</w:t>
+      </w:r>
+    </w:p>
+    <w:p>
+      <w:pPr>
+        <w:jc w:val="center"/>
+      </w:pPr>
+      <w:r>
+        <w:drawing>
+          <wp:inline xmlns:a="http://schemas.openxmlformats.org/drawingml/2006/main" xmlns:pic="http://schemas.openxmlformats.org/drawingml/2006/picture">
+            <wp:extent cx="5486400" cy="5143500"/>
+            <wp:docPr id="14" name="Picture 14"/>
+            <wp:cNvGraphicFramePr>
+              <a:graphicFrameLocks noChangeAspect="1"/>
+            </wp:cNvGraphicFramePr>
+            <a:graphic>
+              <a:graphicData uri="http://schemas.openxmlformats.org/drawingml/2006/picture">
+                <pic:pic>
+                  <pic:nvPicPr>
+                    <pic:cNvPr id="0" name="07-space-live.png"/>
+                    <pic:cNvPicPr/>
+                  </pic:nvPicPr>
+                  <pic:blipFill>
+                    <a:blip r:embed="rId22"/>
+                    <a:stretch>
+                      <a:fillRect/>
+                    </a:stretch>
+                  </pic:blipFill>
+                  <pic:spPr>
+                    <a:xfrm>
+                      <a:off x="0" y="0"/>
+                      <a:ext cx="5486400" cy="5143500"/>
+                    </a:xfrm>
+                    <a:prstGeom prst="rect"/>
+                  </pic:spPr>
+                </pic:pic>
+              </a:graphicData>
+            </a:graphic>
+          </wp:inline>
+        </w:drawing>
+      </w:r>
+    </w:p>
+    <w:p>
+      <w:pPr>
+        <w:jc w:val="center"/>
+      </w:pPr>
+      <w:r>
+        <w:rPr>
+          <w:i/>
+          <w:sz w:val="18"/>
+        </w:rPr>
+        <w:t>Screenshot 8: The live app on Hugging Face Spaces.</w:t>
+      </w:r>
+    </w:p>
+    <w:p>
+      <w:pPr>
+        <w:jc w:val="center"/>
+      </w:pPr>
+      <w:r>
+        <w:drawing>
+          <wp:inline xmlns:a="http://schemas.openxmlformats.org/drawingml/2006/main" xmlns:pic="http://schemas.openxmlformats.org/drawingml/2006/picture">
+            <wp:extent cx="5486400" cy="7929563"/>
+            <wp:docPr id="15" name="Picture 15"/>
+            <wp:cNvGraphicFramePr>
+              <a:graphicFrameLocks noChangeAspect="1"/>
+            </wp:cNvGraphicFramePr>
+            <a:graphic>
+              <a:graphicData uri="http://schemas.openxmlformats.org/drawingml/2006/picture">
+                <pic:pic>
+                  <pic:nvPicPr>
+                    <pic:cNvPr id="0" name="07-space-live-scored.png"/>
+                    <pic:cNvPicPr/>
+                  </pic:nvPicPr>
+                  <pic:blipFill>
+                    <a:blip r:embed="rId23"/>
+                    <a:stretch>
+                      <a:fillRect/>
+                    </a:stretch>
+                  </pic:blipFill>
+                  <pic:spPr>
+                    <a:xfrm>
+                      <a:off x="0" y="0"/>
+                      <a:ext cx="5486400" cy="7929563"/>
+                    </a:xfrm>
+                    <a:prstGeom prst="rect"/>
+                  </pic:spPr>
+                </pic:pic>
+              </a:graphicData>
+            </a:graphic>
+          </wp:inline>
+        </w:drawing>
+      </w:r>
+    </w:p>
+    <w:p>
+      <w:pPr>
+        <w:jc w:val="center"/>
+      </w:pPr>
+      <w:r>
+        <w:rPr>
+          <w:i/>
+          <w:sz w:val="18"/>
+        </w:rPr>
+        <w:t>Screenshot 9: A real prediction scored live on the deployed Space (not a local screenshot).</w:t>
       </w:r>
     </w:p>
     <w:p>
@@ -1520,12 +1622,7 @@
     </w:p>
     <w:p>
       <w:r>
-        <w:t>https://huggingface.co/spaces/krish2105/bank-conversion-copilot</w:t>
-      </w:r>
-    </w:p>
-    <w:p>
-      <w:r>
-        <w:t>[[ Not yet live -- see Section 11. Once HF_TOKEN is set and deploy.yml has run successfully, this URL will serve the live app. ]]</w:t>
+        <w:t>https://huggingface.co/spaces/krish21may/bank</w:t>
       </w:r>
     </w:p>
     <w:p>

</xml_diff>